<commit_message>
Optimise les perfs de navigation, compresse les avatars, corrige le bouton Retour et précise le format wa.me
- Réduit les requêtes Supabase du layout partagé de 6 à 4 par navigation
  (jointures profile_communities au lieu de requêtes séparées)
- Compresse les photos de profil côté client avant upload (max 512px,
  JPEG qualité 0.85) dans le profil et l'assistant d'inscription
- Le bouton "Envoyer l'alerte" ouvre désormais wa.me/?text=... (format
  sans numéro, sélecteur de groupe WhatsApp) au lieu de copier le texte
- Ajoute un composant BackButton partagé basé sur router.back() pour que
  "Retour" ramène vers la page précédente au lieu de toujours Programme
- Met à jour le cahier des charges (v0.10) : précise le format du lien
  wa.me (sections 4.2 et 11) et le texte d'alerte généré dynamiquement

Co-Authored-By: Claude Sonnet 5 <noreply@anthropic.com>
</commit_message>
<xml_diff>
--- a/docs/cahier-des-charges-la-chimere.docx
+++ b/docs/cahier-des-charges-la-chimere.docx
@@ -64,7 +64,7 @@
           <w:sz w:val="20"/>
           <w:szCs w:val="20"/>
         </w:rPr>
-        <w:t xml:space="preserve">Version 0.9 — Document de travail, à valider avec le comité</w:t>
+        <w:t xml:space="preserve">Version 0.10 — Document de travail, à valider avec le comité</w:t>
       </w:r>
     </w:p>
     <w:p>
@@ -78,7 +78,7 @@
           <w:sz w:val="20"/>
           <w:szCs w:val="20"/>
         </w:rPr>
-        <w:t xml:space="preserve">Rédigé le 17 août 2026, mis à jour le 19 août 2026 — Porteur du projet : Louis-Marie Beaudet</w:t>
+        <w:t xml:space="preserve">Rédigé le 17 août 2026, mis à jour le 20 août 2026 — Porteur du projet : Louis-Marie Beaudet</w:t>
       </w:r>
     </w:p>
     <w:p>
@@ -1359,6 +1359,19 @@
         <w:spacing w:after="90"/>
       </w:pPr>
       <w:r>
+        <w:t xml:space="preserve">Précision sur le format du lien : https://wa.me/?text=&lt;message encodé&gt;, sans numéro de téléphone (équivalent : https://api.whatsapp.com/send?text=...). Ce format ouvre WhatsApp avec le message pré-rempli et affiche le sélecteur de contacts/groupes de l'utilisateur, qui choisit lui-même le groupe "organisation" et appuie sur Envoyer — le format avec un numéro de téléphone (wa.me/&lt;numéro&gt;?text=...), qui cible un contact précis, ne convient pas ici. Message généré, avec le jour et l'heure réels de l'évènement insérés dynamiquement : « Salut, on a pas de clé du local pour [jour] à [heure]. Qui peut passer ? Merci ! » — exemple pour un évènement du jeudi 20 à 18h : « Salut, on a pas de clé du local pour Jeudi 20 à 18h. Qui peut passer ? Merci ! »</w:t>
+      </w:r>
+    </w:p>
+    <w:p>
+      <w:pPr>
+        <w:pStyle w:val="ListParagraph"/>
+        <w:numPr>
+          <w:ilvl w:val="0"/>
+          <w:numId w:val="2"/>
+        </w:numPr>
+        <w:spacing w:after="90"/>
+      </w:pPr>
+      <w:r>
         <w:t xml:space="preserve">Un membre du comité clique une seule fois pour diffuser ce message à tout le groupe en une fois — pas d'envoi individuel répété vers chaque porteur de clé.</w:t>
       </w:r>
     </w:p>
@@ -3092,7 +3105,7 @@
           <w:sz w:val="20"/>
           <w:szCs w:val="20"/>
         </w:rPr>
-        <w:t xml:space="preserve">Ce document est une base de travail (version 0.8) : toute correction, ajout ou suppression est bienvenue avant de lancer le développement du POC.</w:t>
+        <w:t xml:space="preserve">Ce document est une base de travail (version 0.10) : toute correction, ajout ou suppression est bienvenue avant de lancer le développement du POC.</w:t>
       </w:r>
     </w:p>
     <w:p>
@@ -3131,7 +3144,7 @@
         <w:spacing w:after="160"/>
       </w:pPr>
       <w:r>
-        <w:t xml:space="preserve">Fonctionnement : le site génère un texte d'alerte prêt à l'emploi (ex. « Partie prévue demain 20h, personne n'a la clé, qui peut passer ? »). Le membre clique sur un lien wa.me qui ouvre directement une conversation WhatsApp pré-remplie, ou copie le texte pour le coller lui-même dans le groupe du club.</w:t>
+        <w:t xml:space="preserve">Fonctionnement : le site génère un texte d'alerte prêt à l'emploi, avec le jour et l'heure réels de l'évènement insérés dynamiquement (ex. « Salut, on a pas de clé du local pour Jeudi 20 à 18h. Qui peut passer ? Merci ! »). Le lien utilise le format sans numéro de téléphone, https://wa.me/?text=&lt;message encodé&gt; (équivalent : https://api.whatsapp.com/send?text=...) : il ouvre WhatsApp avec le message pré-rempli et affiche le sélecteur de contacts/groupes de l'utilisateur, qui choisit lui-même le groupe "organisation" et appuie sur Envoyer — le format avec un numéro de téléphone (wa.me/&lt;numéro&gt;?text=...), qui cible un contact précis, ne convient pas ici. Le membre peut aussi copier le texte pour le coller lui-même dans le groupe du club.</w:t>
       </w:r>
     </w:p>
     <w:p>

</xml_diff>